<commit_message>
Fill student details in report; justify text with 1.5 line spacing
Adds student name, enrolment number, internal guide, branch (Computer
Science & Engineering) and HOD to the cover, certificate and page
header. Body text is now justified with 1.5 line spacing, front-matter
text is kept clear of the page border, and the tools table is compacted
so Chapter 1 fits on two pages. README gains an author line.

Co-Authored-By: Claude Opus 5.5 <noreply@anthropic.com>
Claude-Session: https://claude.ai/code/session_014iXMkVaQ3ohPokwfX5wbpn
</commit_message>
<xml_diff>
--- a/report/PinkTax_Internship_Report.docx
+++ b/report/PinkTax_Internship_Report.docx
@@ -485,11 +485,11 @@
             <w:r>
               <w:rPr>
                 <w:b/>
-                <w:color w:val="E36C0A"/>
                 <w:sz w:val="26"/>
                 <w:szCs w:val="26"/>
+                <w:color w:val="000000"/>
               </w:rPr>
-              <w:t>&lt;Name of Student&gt;</w:t>
+              <w:t xml:space="preserve">Kanishka Shah</w:t>
             </w:r>
           </w:p>
         </w:tc>
@@ -511,11 +511,11 @@
             <w:r>
               <w:rPr>
                 <w:b/>
-                <w:color w:val="E36C0A"/>
                 <w:sz w:val="26"/>
                 <w:szCs w:val="26"/>
+                <w:color w:val="000000"/>
               </w:rPr>
-              <w:t>&lt;Enrolment No.&gt;</w:t>
+              <w:t xml:space="preserve">231260131051</w:t>
             </w:r>
           </w:p>
         </w:tc>
@@ -725,7 +725,7 @@
           <w:sz w:val="28"/>
           <w:szCs w:val="28"/>
         </w:rPr>
-        <w:t>Computer Engineering</w:t>
+        <w:t xml:space="preserve">Computer Science &amp; Engineering</w:t>
       </w:r>
     </w:p>
     <w:p>
@@ -802,11 +802,11 @@
       <w:r>
         <w:rPr>
           <w:b/>
-          <w:color w:val="E36C0A"/>
           <w:sz w:val="26"/>
           <w:szCs w:val="26"/>
-        </w:rPr>
-        <w:t>&lt;Name of Internal guide&gt;</w:t>
+          <w:color w:val="000000"/>
+        </w:rPr>
+        <w:t xml:space="preserve">Prof. Himani Patel</w:t>
       </w:r>
     </w:p>
     <w:p>
@@ -1541,27 +1541,29 @@
         <w:rPr>
           <w:sz w:val="28"/>
           <w:szCs w:val="28"/>
-        </w:rPr>
-        <w:t>CE/IT/CSE/</w:t>
+          <w:color w:val="000000"/>
+        </w:rPr>
+        <w:br/>
+        <w:t xml:space="preserve">COMPUTER SCIENCE &amp; ENGINEERING</w:t>
       </w:r>
       <w:r>
         <w:rPr>
           <w:sz w:val="28"/>
           <w:szCs w:val="28"/>
         </w:rPr>
-        <w:t>ICT</w:t>
+        <w:t xml:space="preserve"/>
       </w:r>
       <w:r>
         <w:rPr>
           <w:color w:val="FF0000"/>
         </w:rPr>
-        <w:t xml:space="preserve"> (</w:t>
+        <w:t xml:space="preserve"/>
       </w:r>
       <w:r>
         <w:rPr>
           <w:color w:val="FF0000"/>
         </w:rPr>
-        <w:t>Write Full Name of Branch)</w:t>
+        <w:t xml:space="preserve"/>
       </w:r>
       <w:r>
         <w:rPr>
@@ -1778,10 +1780,10 @@
         <w:rPr>
           <w:b/>
         </w:rPr>
-        <w:t xml:space="preserve">&lt;student name&gt; (&lt;enrolment&gt;)  </w:t>
-      </w:r>
-      <w:r>
-        <w:t>under  my guidance  in  completion  of  Summer  Internship  in  Computer Engineering/Information Technology/ Computer Science &amp; Technology/ICT Branch 7</w:t>
+        <w:t xml:space="preserve">Kanishka Shah (231260131051) </w:t>
+      </w:r>
+      <w:r>
+        <w:t xml:space="preserve">under my guidance in completion of Summer Internship in Computer Science &amp; Engineering Branch, 7</w:t>
       </w:r>
       <w:r>
         <w:rPr>
@@ -1789,7 +1791,7 @@
           <w:szCs w:val="26"/>
           <w:vertAlign w:val="superscript"/>
         </w:rPr>
-        <w:t xml:space="preserve">th  </w:t>
+        <w:t xml:space="preserve">th </w:t>
       </w:r>
       <w:r>
         <w:t>Semester of Gujarat Technological University, Ahmedab</w:t>
@@ -1932,8 +1934,9 @@
             <w:r>
               <w:rPr>
                 <w:b/>
+                <w:color w:val="000000"/>
               </w:rPr>
-              <w:t>&lt;Guide Name&gt;</w:t>
+              <w:t xml:space="preserve">Prof. Himani Patel</w:t>
             </w:r>
           </w:p>
         </w:tc>
@@ -1949,16 +1952,16 @@
               <w:ind w:right="67"/>
             </w:pPr>
             <w:r>
-              <w:t>Dr.</w:t>
+              <w:t xml:space="preserve">Dr. </w:t>
             </w:r>
             <w:r>
-              <w:t>Madhuri Parekh/</w:t>
+              <w:t xml:space="preserve">Madhuri Parekh</w:t>
             </w:r>
             <w:r>
-              <w:t>Prof.</w:t>
+              <w:t xml:space="preserve"/>
             </w:r>
             <w:r>
-              <w:t>SachiBhavsar</w:t>
+              <w:t xml:space="preserve"/>
             </w:r>
           </w:p>
         </w:tc>
@@ -2019,7 +2022,7 @@
               <w:ind w:right="67"/>
             </w:pPr>
             <w:r>
-              <w:t>Computer Engineering/ICT/CSE/IT</w:t>
+              <w:t xml:space="preserve">Computer Science &amp; Engineering</w:t>
             </w:r>
           </w:p>
         </w:tc>
@@ -2041,7 +2044,7 @@
               <w:t>, CSE</w:t>
             </w:r>
             <w:r>
-              <w:t>, IT</w:t>
+              <w:t xml:space="preserve">, IT </w:t>
             </w:r>
             <w:r>
               <w:t>&amp; ICT Department</w:t>
@@ -2209,14 +2212,15 @@
     <w:p>
       <w:pPr>
         <w:pStyle w:val="Normal1"/>
-        <w:spacing w:after="80" w:line="312" w:lineRule="auto"/>
-        <w:jc w:val="both"/>
-      </w:pPr>
-    </w:p>
-    <w:p>
-      <w:pPr>
-        <w:pStyle w:val="Normal1"/>
-        <w:spacing w:after="140" w:line="300" w:lineRule="auto"/>
+        <w:spacing w:after="80" w:line="360" w:lineRule="auto"/>
+        <w:jc w:val="both"/>
+      </w:pPr>
+    </w:p>
+    <w:p>
+      <w:pPr>
+        <w:pStyle w:val="Normal1"/>
+        <w:spacing w:after="120" w:line="360" w:lineRule="auto"/>
+        <w:ind w:left="432" w:right="432"/>
         <w:jc w:val="both"/>
       </w:pPr>
       <w:r>
@@ -2229,7 +2233,8 @@
     <w:p>
       <w:pPr>
         <w:pStyle w:val="Normal1"/>
-        <w:spacing w:after="140" w:line="300" w:lineRule="auto"/>
+        <w:spacing w:after="120" w:line="360" w:lineRule="auto"/>
+        <w:ind w:left="432" w:right="432"/>
         <w:jc w:val="both"/>
       </w:pPr>
       <w:r>
@@ -2320,7 +2325,8 @@
     <w:p>
       <w:pPr>
         <w:pStyle w:val="Normal1"/>
-        <w:spacing w:after="140" w:line="300" w:lineRule="auto"/>
+        <w:spacing w:after="120" w:line="360" w:lineRule="auto"/>
+        <w:ind w:left="432" w:right="432"/>
         <w:jc w:val="both"/>
       </w:pPr>
       <w:r>
@@ -2333,7 +2339,8 @@
     <w:p>
       <w:pPr>
         <w:pStyle w:val="Normal1"/>
-        <w:spacing w:after="140" w:line="300" w:lineRule="auto"/>
+        <w:spacing w:after="120" w:line="360" w:lineRule="auto"/>
+        <w:ind w:left="432" w:right="432"/>
         <w:jc w:val="both"/>
       </w:pPr>
       <w:r>
@@ -2359,7 +2366,8 @@
     <w:p>
       <w:pPr>
         <w:pStyle w:val="Normal1"/>
-        <w:spacing w:after="140" w:line="300" w:lineRule="auto"/>
+        <w:spacing w:after="120" w:line="360" w:lineRule="auto"/>
+        <w:ind w:left="432" w:right="432"/>
         <w:jc w:val="both"/>
       </w:pPr>
       <w:r>
@@ -2406,14 +2414,15 @@
     <w:p>
       <w:pPr>
         <w:pStyle w:val="Normal1"/>
-        <w:spacing w:after="40" w:line="312" w:lineRule="auto"/>
-        <w:jc w:val="both"/>
-      </w:pPr>
-    </w:p>
-    <w:p>
-      <w:pPr>
-        <w:pStyle w:val="Normal1"/>
-        <w:spacing w:after="140" w:line="300" w:lineRule="auto"/>
+        <w:spacing w:after="40" w:line="360" w:lineRule="auto"/>
+        <w:jc w:val="both"/>
+      </w:pPr>
+    </w:p>
+    <w:p>
+      <w:pPr>
+        <w:pStyle w:val="Normal1"/>
+        <w:spacing w:after="120" w:line="360" w:lineRule="auto"/>
+        <w:ind w:left="432" w:right="432"/>
         <w:jc w:val="both"/>
       </w:pPr>
       <w:r>
@@ -2439,7 +2448,8 @@
     <w:p>
       <w:pPr>
         <w:pStyle w:val="Normal1"/>
-        <w:spacing w:after="140" w:line="300" w:lineRule="auto"/>
+        <w:spacing w:after="120" w:line="360" w:lineRule="auto"/>
+        <w:ind w:left="432" w:right="432"/>
         <w:jc w:val="both"/>
       </w:pPr>
       <w:r>
@@ -2465,7 +2475,8 @@
     <w:p>
       <w:pPr>
         <w:pStyle w:val="Normal1"/>
-        <w:spacing w:after="140" w:line="300" w:lineRule="auto"/>
+        <w:spacing w:after="120" w:line="360" w:lineRule="auto"/>
+        <w:ind w:left="432" w:right="432"/>
         <w:jc w:val="both"/>
       </w:pPr>
       <w:r>
@@ -2478,7 +2489,8 @@
     <w:p>
       <w:pPr>
         <w:pStyle w:val="Normal1"/>
-        <w:spacing w:after="140" w:line="300" w:lineRule="auto"/>
+        <w:spacing w:after="120" w:line="360" w:lineRule="auto"/>
+        <w:ind w:left="432" w:right="432"/>
         <w:jc w:val="both"/>
       </w:pPr>
       <w:r>
@@ -3305,7 +3317,7 @@
     <w:p>
       <w:pPr>
         <w:pStyle w:val="Normal1"/>
-        <w:spacing w:after="120" w:line="312" w:lineRule="auto"/>
+        <w:spacing w:after="120" w:line="360" w:lineRule="auto"/>
         <w:jc w:val="both"/>
       </w:pPr>
       <w:r>
@@ -3344,7 +3356,7 @@
     <w:p>
       <w:pPr>
         <w:pStyle w:val="Normal1"/>
-        <w:spacing w:after="120" w:line="312" w:lineRule="auto"/>
+        <w:spacing w:after="120" w:line="360" w:lineRule="auto"/>
         <w:jc w:val="both"/>
       </w:pPr>
       <w:r>
@@ -3361,7 +3373,7 @@
           <w:ilvl w:val="0"/>
           <w:numId w:val="201"/>
         </w:numPr>
-        <w:spacing w:after="60" w:line="312" w:lineRule="auto"/>
+        <w:spacing w:after="60" w:line="360" w:lineRule="auto"/>
         <w:ind w:left="720" w:hanging="360"/>
         <w:jc w:val="both"/>
       </w:pPr>
@@ -3386,7 +3398,7 @@
           <w:ilvl w:val="0"/>
           <w:numId w:val="201"/>
         </w:numPr>
-        <w:spacing w:after="60" w:line="312" w:lineRule="auto"/>
+        <w:spacing w:after="60" w:line="360" w:lineRule="auto"/>
         <w:ind w:left="720" w:hanging="360"/>
         <w:jc w:val="both"/>
       </w:pPr>
@@ -3411,7 +3423,7 @@
           <w:ilvl w:val="0"/>
           <w:numId w:val="201"/>
         </w:numPr>
-        <w:spacing w:after="60" w:line="312" w:lineRule="auto"/>
+        <w:spacing w:after="60" w:line="360" w:lineRule="auto"/>
         <w:ind w:left="720" w:hanging="360"/>
         <w:jc w:val="both"/>
       </w:pPr>
@@ -3436,7 +3448,7 @@
           <w:ilvl w:val="0"/>
           <w:numId w:val="201"/>
         </w:numPr>
-        <w:spacing w:after="60" w:line="312" w:lineRule="auto"/>
+        <w:spacing w:after="60" w:line="360" w:lineRule="auto"/>
         <w:ind w:left="720" w:hanging="360"/>
         <w:jc w:val="both"/>
       </w:pPr>
@@ -3464,7 +3476,7 @@
     <w:p>
       <w:pPr>
         <w:pStyle w:val="Normal1"/>
-        <w:spacing w:after="120" w:line="312" w:lineRule="auto"/>
+        <w:spacing w:after="120" w:line="360" w:lineRule="auto"/>
         <w:jc w:val="both"/>
       </w:pPr>
       <w:r>
@@ -3490,7 +3502,7 @@
     <w:p>
       <w:pPr>
         <w:pStyle w:val="Normal1"/>
-        <w:spacing w:after="120" w:line="312" w:lineRule="auto"/>
+        <w:spacing w:after="120" w:line="360" w:lineRule="auto"/>
         <w:jc w:val="both"/>
       </w:pPr>
       <w:r>
@@ -3528,7 +3540,7 @@
           <w:ilvl w:val="0"/>
           <w:numId w:val="202"/>
         </w:numPr>
-        <w:spacing w:after="60" w:line="312" w:lineRule="auto"/>
+        <w:spacing w:after="60" w:line="360" w:lineRule="auto"/>
         <w:ind w:left="720" w:hanging="360"/>
         <w:jc w:val="both"/>
       </w:pPr>
@@ -3546,7 +3558,7 @@
           <w:ilvl w:val="0"/>
           <w:numId w:val="202"/>
         </w:numPr>
-        <w:spacing w:after="60" w:line="312" w:lineRule="auto"/>
+        <w:spacing w:after="60" w:line="360" w:lineRule="auto"/>
         <w:ind w:left="720" w:hanging="360"/>
         <w:jc w:val="both"/>
       </w:pPr>
@@ -3564,7 +3576,7 @@
           <w:ilvl w:val="0"/>
           <w:numId w:val="202"/>
         </w:numPr>
-        <w:spacing w:after="60" w:line="312" w:lineRule="auto"/>
+        <w:spacing w:after="60" w:line="360" w:lineRule="auto"/>
         <w:ind w:left="720" w:hanging="360"/>
         <w:jc w:val="both"/>
       </w:pPr>
@@ -3582,7 +3594,7 @@
           <w:ilvl w:val="0"/>
           <w:numId w:val="202"/>
         </w:numPr>
-        <w:spacing w:after="60" w:line="312" w:lineRule="auto"/>
+        <w:spacing w:after="60" w:line="360" w:lineRule="auto"/>
         <w:ind w:left="720" w:hanging="360"/>
         <w:jc w:val="both"/>
       </w:pPr>
@@ -3600,7 +3612,7 @@
           <w:ilvl w:val="0"/>
           <w:numId w:val="202"/>
         </w:numPr>
-        <w:spacing w:after="60" w:line="312" w:lineRule="auto"/>
+        <w:spacing w:after="60" w:line="360" w:lineRule="auto"/>
         <w:ind w:left="720" w:hanging="360"/>
         <w:jc w:val="both"/>
       </w:pPr>
@@ -3618,7 +3630,7 @@
           <w:ilvl w:val="0"/>
           <w:numId w:val="202"/>
         </w:numPr>
-        <w:spacing w:after="60" w:line="312" w:lineRule="auto"/>
+        <w:spacing w:after="60" w:line="360" w:lineRule="auto"/>
         <w:ind w:left="720" w:hanging="360"/>
         <w:jc w:val="both"/>
       </w:pPr>
@@ -3657,7 +3669,7 @@
           <w:ilvl w:val="0"/>
           <w:numId w:val="201"/>
         </w:numPr>
-        <w:spacing w:after="60" w:line="312" w:lineRule="auto"/>
+        <w:spacing w:after="60" w:line="360" w:lineRule="auto"/>
         <w:ind w:left="720" w:hanging="360"/>
         <w:jc w:val="both"/>
       </w:pPr>
@@ -3682,7 +3694,7 @@
           <w:ilvl w:val="0"/>
           <w:numId w:val="201"/>
         </w:numPr>
-        <w:spacing w:after="60" w:line="312" w:lineRule="auto"/>
+        <w:spacing w:after="60" w:line="360" w:lineRule="auto"/>
         <w:ind w:left="720" w:hanging="360"/>
         <w:jc w:val="both"/>
       </w:pPr>
@@ -3707,7 +3719,7 @@
           <w:ilvl w:val="0"/>
           <w:numId w:val="201"/>
         </w:numPr>
-        <w:spacing w:after="60" w:line="312" w:lineRule="auto"/>
+        <w:spacing w:after="60" w:line="360" w:lineRule="auto"/>
         <w:ind w:left="720" w:hanging="360"/>
         <w:jc w:val="both"/>
       </w:pPr>
@@ -3732,7 +3744,7 @@
           <w:ilvl w:val="0"/>
           <w:numId w:val="201"/>
         </w:numPr>
-        <w:spacing w:after="60" w:line="312" w:lineRule="auto"/>
+        <w:spacing w:after="60" w:line="360" w:lineRule="auto"/>
         <w:ind w:left="720" w:hanging="360"/>
         <w:jc w:val="both"/>
       </w:pPr>
@@ -3824,6 +3836,7 @@
             <w:pPr>
               <w:keepNext/>
               <w:spacing w:after="20"/>
+              <w:jc w:val="both"/>
             </w:pPr>
             <w:r>
               <w:rPr>
@@ -3843,6 +3856,7 @@
             <w:pPr>
               <w:keepNext/>
               <w:spacing w:after="20"/>
+              <w:jc w:val="both"/>
             </w:pPr>
             <w:r>
               <w:rPr>
@@ -3866,12 +3880,13 @@
             <w:pPr>
               <w:keepNext/>
               <w:spacing w:after="20"/>
+              <w:jc w:val="both"/>
             </w:pPr>
             <w:r>
               <w:rPr>
                 <w:sz w:val="21"/>
               </w:rPr>
-              <w:t>Python 3.11</w:t>
+              <w:t>Python 3.11 with Google Colab / Jupyter</w:t>
             </w:r>
           </w:p>
         </w:tc>
@@ -3883,12 +3898,13 @@
             <w:pPr>
               <w:keepNext/>
               <w:spacing w:after="20"/>
+              <w:jc w:val="both"/>
             </w:pPr>
             <w:r>
               <w:rPr>
                 <w:sz w:val="21"/>
               </w:rPr>
-              <w:t>Main programming language for the complete data pipeline</w:t>
+              <w:t>Main language and notebooks for the complete, reproducible data pipeline</w:t>
             </w:r>
           </w:p>
         </w:tc>
@@ -3905,12 +3921,13 @@
             <w:pPr>
               <w:keepNext/>
               <w:spacing w:after="20"/>
+              <w:jc w:val="both"/>
             </w:pPr>
             <w:r>
               <w:rPr>
                 <w:sz w:val="21"/>
               </w:rPr>
-              <w:t>Google Colab / Jupyter</w:t>
+              <w:t>NumPy and Pandas</w:t>
             </w:r>
           </w:p>
         </w:tc>
@@ -3922,12 +3939,13 @@
             <w:pPr>
               <w:keepNext/>
               <w:spacing w:after="20"/>
+              <w:jc w:val="both"/>
             </w:pPr>
             <w:r>
               <w:rPr>
                 <w:sz w:val="21"/>
               </w:rPr>
-              <w:t>Interactive notebooks for exploration and a shareable, reproducible analysis</w:t>
+              <w:t>Numerical operations, bootstrap resampling; loading, cleaning, grouping and pivoting data</w:t>
             </w:r>
           </w:p>
         </w:tc>
@@ -3944,84 +3962,7 @@
             <w:pPr>
               <w:keepNext/>
               <w:spacing w:after="20"/>
-            </w:pPr>
-            <w:r>
-              <w:rPr>
-                <w:sz w:val="21"/>
-              </w:rPr>
-              <w:t>NumPy</w:t>
-            </w:r>
-          </w:p>
-        </w:tc>
-        <w:tc>
-          <w:tcPr>
-            <w:tcW w:type="dxa" w:w="6336"/>
-          </w:tcPr>
-          <w:p>
-            <w:pPr>
-              <w:keepNext/>
-              <w:spacing w:after="20"/>
-            </w:pPr>
-            <w:r>
-              <w:rPr>
-                <w:sz w:val="21"/>
-              </w:rPr>
-              <w:t>Fast numerical operations, logarithms, bootstrap resampling</w:t>
-            </w:r>
-          </w:p>
-        </w:tc>
-      </w:tr>
-      <w:tr>
-        <w:trPr>
-          <w:cantSplit/>
-        </w:trPr>
-        <w:tc>
-          <w:tcPr>
-            <w:tcW w:type="dxa" w:w="2880"/>
-          </w:tcPr>
-          <w:p>
-            <w:pPr>
-              <w:keepNext/>
-              <w:spacing w:after="20"/>
-            </w:pPr>
-            <w:r>
-              <w:rPr>
-                <w:sz w:val="21"/>
-              </w:rPr>
-              <w:t>Pandas</w:t>
-            </w:r>
-          </w:p>
-        </w:tc>
-        <w:tc>
-          <w:tcPr>
-            <w:tcW w:type="dxa" w:w="6336"/>
-          </w:tcPr>
-          <w:p>
-            <w:pPr>
-              <w:keepNext/>
-              <w:spacing w:after="20"/>
-            </w:pPr>
-            <w:r>
-              <w:rPr>
-                <w:sz w:val="21"/>
-              </w:rPr>
-              <w:t>Loading, cleaning, merging, grouping and pivoting tabular data</w:t>
-            </w:r>
-          </w:p>
-        </w:tc>
-      </w:tr>
-      <w:tr>
-        <w:trPr>
-          <w:cantSplit/>
-        </w:trPr>
-        <w:tc>
-          <w:tcPr>
-            <w:tcW w:type="dxa" w:w="2880"/>
-          </w:tcPr>
-          <w:p>
-            <w:pPr>
-              <w:keepNext/>
-              <w:spacing w:after="20"/>
+              <w:jc w:val="both"/>
             </w:pPr>
             <w:r>
               <w:rPr>
@@ -4039,6 +3980,7 @@
             <w:pPr>
               <w:keepNext/>
               <w:spacing w:after="20"/>
+              <w:jc w:val="both"/>
             </w:pPr>
             <w:r>
               <w:rPr>
@@ -4061,12 +4003,13 @@
             <w:pPr>
               <w:keepNext/>
               <w:spacing w:after="20"/>
+              <w:jc w:val="both"/>
             </w:pPr>
             <w:r>
               <w:rPr>
                 <w:sz w:val="21"/>
               </w:rPr>
-              <w:t>Matplotlib &amp; Seaborn</w:t>
+              <w:t>Matplotlib, Seaborn and Plotly</w:t>
             </w:r>
           </w:p>
         </w:tc>
@@ -4078,12 +4021,13 @@
             <w:pPr>
               <w:keepNext/>
               <w:spacing w:after="20"/>
+              <w:jc w:val="both"/>
             </w:pPr>
             <w:r>
               <w:rPr>
                 <w:sz w:val="21"/>
               </w:rPr>
-              <w:t>Static publication-quality charts (box plots, dot plots, heatmaps)</w:t>
+              <w:t>Publication-quality static charts and an interactive chart with hover details</w:t>
             </w:r>
           </w:p>
         </w:tc>
@@ -4100,12 +4044,13 @@
             <w:pPr>
               <w:keepNext/>
               <w:spacing w:after="20"/>
+              <w:jc w:val="both"/>
             </w:pPr>
             <w:r>
               <w:rPr>
                 <w:sz w:val="21"/>
               </w:rPr>
-              <w:t>Plotly</w:t>
+              <w:t>SciPy and Statsmodels</w:t>
             </w:r>
           </w:p>
         </w:tc>
@@ -4117,12 +4062,13 @@
             <w:pPr>
               <w:keepNext/>
               <w:spacing w:after="20"/>
+              <w:jc w:val="both"/>
             </w:pPr>
             <w:r>
               <w:rPr>
                 <w:sz w:val="21"/>
               </w:rPr>
-              <w:t>Interactive chart with hover details</w:t>
+              <w:t>Mann-Whitney, Welch, Wilcoxon and chi-square tests; OLS / fixed-effects regression, FDR correction</w:t>
             </w:r>
           </w:p>
         </w:tc>
@@ -4139,84 +4085,7 @@
             <w:pPr>
               <w:keepNext/>
               <w:spacing w:after="20"/>
-            </w:pPr>
-            <w:r>
-              <w:rPr>
-                <w:sz w:val="21"/>
-              </w:rPr>
-              <w:t>SciPy</w:t>
-            </w:r>
-          </w:p>
-        </w:tc>
-        <w:tc>
-          <w:tcPr>
-            <w:tcW w:type="dxa" w:w="6336"/>
-          </w:tcPr>
-          <w:p>
-            <w:pPr>
-              <w:keepNext/>
-              <w:spacing w:after="20"/>
-            </w:pPr>
-            <w:r>
-              <w:rPr>
-                <w:sz w:val="21"/>
-              </w:rPr>
-              <w:t>Mann-Whitney U, Welch t-test, Wilcoxon, binomial and chi-square tests</w:t>
-            </w:r>
-          </w:p>
-        </w:tc>
-      </w:tr>
-      <w:tr>
-        <w:trPr>
-          <w:cantSplit/>
-        </w:trPr>
-        <w:tc>
-          <w:tcPr>
-            <w:tcW w:type="dxa" w:w="2880"/>
-          </w:tcPr>
-          <w:p>
-            <w:pPr>
-              <w:keepNext/>
-              <w:spacing w:after="20"/>
-            </w:pPr>
-            <w:r>
-              <w:rPr>
-                <w:sz w:val="21"/>
-              </w:rPr>
-              <w:t>Statsmodels</w:t>
-            </w:r>
-          </w:p>
-        </w:tc>
-        <w:tc>
-          <w:tcPr>
-            <w:tcW w:type="dxa" w:w="6336"/>
-          </w:tcPr>
-          <w:p>
-            <w:pPr>
-              <w:keepNext/>
-              <w:spacing w:after="20"/>
-            </w:pPr>
-            <w:r>
-              <w:rPr>
-                <w:sz w:val="21"/>
-              </w:rPr>
-              <w:t>OLS and fixed-effects regression, clustered errors, FDR correction</w:t>
-            </w:r>
-          </w:p>
-        </w:tc>
-      </w:tr>
-      <w:tr>
-        <w:trPr>
-          <w:cantSplit/>
-        </w:trPr>
-        <w:tc>
-          <w:tcPr>
-            <w:tcW w:type="dxa" w:w="2880"/>
-          </w:tcPr>
-          <w:p>
-            <w:pPr>
-              <w:keepNext/>
-              <w:spacing w:after="20"/>
+              <w:jc w:val="both"/>
             </w:pPr>
             <w:r>
               <w:rPr>
@@ -4234,6 +4103,7 @@
             <w:pPr>
               <w:keepNext/>
               <w:spacing w:after="20"/>
+              <w:jc w:val="both"/>
             </w:pPr>
             <w:r>
               <w:rPr>
@@ -4256,12 +4126,13 @@
             <w:pPr>
               <w:keepNext/>
               <w:spacing w:after="20"/>
+              <w:jc w:val="both"/>
             </w:pPr>
             <w:r>
               <w:rPr>
                 <w:sz w:val="21"/>
               </w:rPr>
-              <w:t>OpenPyXL</w:t>
+              <w:t>Microsoft Excel and OpenPyXL</w:t>
             </w:r>
           </w:p>
         </w:tc>
@@ -4273,12 +4144,13 @@
             <w:pPr>
               <w:keepNext/>
               <w:spacing w:after="20"/>
+              <w:jc w:val="both"/>
             </w:pPr>
             <w:r>
               <w:rPr>
                 <w:sz w:val="21"/>
               </w:rPr>
-              <w:t>Generating the Excel workbook with formulas, tables and charts</w:t>
+              <w:t>Workbook with COUNTIFS / AVERAGEIFS summaries, pivot-style tables, conditional formatting</w:t>
             </w:r>
           </w:p>
         </w:tc>
@@ -4295,45 +4167,7 @@
             <w:pPr>
               <w:keepNext/>
               <w:spacing w:after="20"/>
-            </w:pPr>
-            <w:r>
-              <w:rPr>
-                <w:sz w:val="21"/>
-              </w:rPr>
-              <w:t>Microsoft Excel</w:t>
-            </w:r>
-          </w:p>
-        </w:tc>
-        <w:tc>
-          <w:tcPr>
-            <w:tcW w:type="dxa" w:w="6336"/>
-          </w:tcPr>
-          <w:p>
-            <w:pPr>
-              <w:keepNext/>
-              <w:spacing w:after="20"/>
-            </w:pPr>
-            <w:r>
-              <w:rPr>
-                <w:sz w:val="21"/>
-              </w:rPr>
-              <w:t>COUNTIFS / AVERAGEIFS summaries, pivot-style tables, conditional formatting</w:t>
-            </w:r>
-          </w:p>
-        </w:tc>
-      </w:tr>
-      <w:tr>
-        <w:trPr>
-          <w:cantSplit/>
-        </w:trPr>
-        <w:tc>
-          <w:tcPr>
-            <w:tcW w:type="dxa" w:w="2880"/>
-          </w:tcPr>
-          <w:p>
-            <w:pPr>
-              <w:keepNext/>
-              <w:spacing w:after="20"/>
+              <w:jc w:val="both"/>
             </w:pPr>
             <w:r>
               <w:rPr>
@@ -4351,6 +4185,7 @@
             <w:pPr>
               <w:keepNext/>
               <w:spacing w:after="20"/>
+              <w:jc w:val="both"/>
             </w:pPr>
             <w:r>
               <w:rPr>
@@ -4371,52 +4206,14 @@
           </w:tcPr>
           <w:p>
             <w:pPr>
-              <w:keepNext/>
               <w:spacing w:after="20"/>
+              <w:jc w:val="both"/>
             </w:pPr>
             <w:r>
               <w:rPr>
                 <w:sz w:val="21"/>
               </w:rPr>
-              <w:t>Git &amp; GitHub</w:t>
-            </w:r>
-          </w:p>
-        </w:tc>
-        <w:tc>
-          <w:tcPr>
-            <w:tcW w:type="dxa" w:w="6336"/>
-          </w:tcPr>
-          <w:p>
-            <w:pPr>
-              <w:keepNext/>
-              <w:spacing w:after="20"/>
-            </w:pPr>
-            <w:r>
-              <w:rPr>
-                <w:sz w:val="21"/>
-              </w:rPr>
-              <w:t>Version control and publishing the project (github.com/mppyxx/PinkTax)</w:t>
-            </w:r>
-          </w:p>
-        </w:tc>
-      </w:tr>
-      <w:tr>
-        <w:trPr>
-          <w:cantSplit/>
-        </w:trPr>
-        <w:tc>
-          <w:tcPr>
-            <w:tcW w:type="dxa" w:w="2880"/>
-          </w:tcPr>
-          <w:p>
-            <w:pPr>
-              <w:spacing w:after="20"/>
-            </w:pPr>
-            <w:r>
-              <w:rPr>
-                <w:sz w:val="21"/>
-              </w:rPr>
-              <w:t>Kaggle</w:t>
+              <w:t>Git, GitHub and Kaggle</w:t>
             </w:r>
           </w:p>
         </w:tc>
@@ -4427,12 +4224,13 @@
           <w:p>
             <w:pPr>
               <w:spacing w:after="20"/>
+              <w:jc w:val="both"/>
             </w:pPr>
             <w:r>
               <w:rPr>
                 <w:sz w:val="21"/>
               </w:rPr>
-              <w:t>Source of the three public datasets</w:t>
+              <w:t>Version control, publishing (github.com/mppyxx/PinkTax) and the data source</w:t>
             </w:r>
           </w:p>
         </w:tc>
@@ -4461,7 +4259,7 @@
     <w:p>
       <w:pPr>
         <w:pStyle w:val="Normal1"/>
-        <w:spacing w:after="120" w:line="312" w:lineRule="auto"/>
+        <w:spacing w:after="120" w:line="360" w:lineRule="auto"/>
         <w:jc w:val="both"/>
       </w:pPr>
       <w:r>
@@ -4540,6 +4338,7 @@
             <w:pPr>
               <w:keepNext/>
               <w:spacing w:after="20"/>
+              <w:jc w:val="both"/>
             </w:pPr>
             <w:r>
               <w:rPr>
@@ -4559,6 +4358,7 @@
             <w:pPr>
               <w:keepNext/>
               <w:spacing w:after="20"/>
+              <w:jc w:val="both"/>
             </w:pPr>
             <w:r>
               <w:rPr>
@@ -4578,6 +4378,7 @@
             <w:pPr>
               <w:keepNext/>
               <w:spacing w:after="20"/>
+              <w:jc w:val="both"/>
             </w:pPr>
             <w:r>
               <w:rPr>
@@ -4597,6 +4398,7 @@
             <w:pPr>
               <w:keepNext/>
               <w:spacing w:after="20"/>
+              <w:jc w:val="both"/>
             </w:pPr>
             <w:r>
               <w:rPr>
@@ -4620,6 +4422,7 @@
             <w:pPr>
               <w:keepNext/>
               <w:spacing w:after="20"/>
+              <w:jc w:val="both"/>
             </w:pPr>
             <w:r>
               <w:rPr>
@@ -4637,6 +4440,7 @@
             <w:pPr>
               <w:keepNext/>
               <w:spacing w:after="20"/>
+              <w:jc w:val="both"/>
             </w:pPr>
             <w:r>
               <w:rPr>
@@ -4654,6 +4458,7 @@
             <w:pPr>
               <w:keepNext/>
               <w:spacing w:after="20"/>
+              <w:jc w:val="both"/>
             </w:pPr>
             <w:r>
               <w:rPr>
@@ -4671,6 +4476,7 @@
             <w:pPr>
               <w:keepNext/>
               <w:spacing w:after="20"/>
+              <w:jc w:val="both"/>
             </w:pPr>
             <w:r>
               <w:rPr>
@@ -4693,6 +4499,7 @@
             <w:pPr>
               <w:keepNext/>
               <w:spacing w:after="20"/>
+              <w:jc w:val="both"/>
             </w:pPr>
             <w:r>
               <w:rPr>
@@ -4710,6 +4517,7 @@
             <w:pPr>
               <w:keepNext/>
               <w:spacing w:after="20"/>
+              <w:jc w:val="both"/>
             </w:pPr>
             <w:r>
               <w:rPr>
@@ -4727,6 +4535,7 @@
             <w:pPr>
               <w:keepNext/>
               <w:spacing w:after="20"/>
+              <w:jc w:val="both"/>
             </w:pPr>
             <w:r>
               <w:rPr>
@@ -4744,6 +4553,7 @@
             <w:pPr>
               <w:keepNext/>
               <w:spacing w:after="20"/>
+              <w:jc w:val="both"/>
             </w:pPr>
             <w:r>
               <w:rPr>
@@ -4766,6 +4576,7 @@
             <w:pPr>
               <w:keepNext/>
               <w:spacing w:after="20"/>
+              <w:jc w:val="both"/>
             </w:pPr>
             <w:r>
               <w:rPr>
@@ -4783,6 +4594,7 @@
             <w:pPr>
               <w:keepNext/>
               <w:spacing w:after="20"/>
+              <w:jc w:val="both"/>
             </w:pPr>
             <w:r>
               <w:rPr>
@@ -4800,6 +4612,7 @@
             <w:pPr>
               <w:keepNext/>
               <w:spacing w:after="20"/>
+              <w:jc w:val="both"/>
             </w:pPr>
             <w:r>
               <w:rPr>
@@ -4817,6 +4630,7 @@
             <w:pPr>
               <w:keepNext/>
               <w:spacing w:after="20"/>
+              <w:jc w:val="both"/>
             </w:pPr>
             <w:r>
               <w:rPr>
@@ -4838,6 +4652,7 @@
           <w:p>
             <w:pPr>
               <w:spacing w:after="20"/>
+              <w:jc w:val="both"/>
             </w:pPr>
             <w:r>
               <w:rPr>
@@ -4855,6 +4670,7 @@
           <w:p>
             <w:pPr>
               <w:spacing w:after="20"/>
+              <w:jc w:val="both"/>
             </w:pPr>
           </w:p>
         </w:tc>
@@ -4865,6 +4681,7 @@
           <w:p>
             <w:pPr>
               <w:spacing w:after="20"/>
+              <w:jc w:val="both"/>
             </w:pPr>
             <w:r>
               <w:rPr>
@@ -4882,6 +4699,7 @@
           <w:p>
             <w:pPr>
               <w:spacing w:after="20"/>
+              <w:jc w:val="both"/>
             </w:pPr>
             <w:r>
               <w:rPr>
@@ -4931,7 +4749,7 @@
     <w:p>
       <w:pPr>
         <w:pStyle w:val="Normal1"/>
-        <w:spacing w:after="120" w:line="312" w:lineRule="auto"/>
+        <w:spacing w:after="120" w:line="360" w:lineRule="auto"/>
         <w:jc w:val="both"/>
       </w:pPr>
       <w:r>
@@ -4969,7 +4787,7 @@
           <w:ilvl w:val="0"/>
           <w:numId w:val="201"/>
         </w:numPr>
-        <w:spacing w:after="60" w:line="312" w:lineRule="auto"/>
+        <w:spacing w:after="60" w:line="360" w:lineRule="auto"/>
         <w:ind w:left="720" w:hanging="360"/>
         <w:jc w:val="both"/>
       </w:pPr>
@@ -4987,7 +4805,7 @@
           <w:ilvl w:val="0"/>
           <w:numId w:val="201"/>
         </w:numPr>
-        <w:spacing w:after="60" w:line="312" w:lineRule="auto"/>
+        <w:spacing w:after="60" w:line="360" w:lineRule="auto"/>
         <w:ind w:left="720" w:hanging="360"/>
         <w:jc w:val="both"/>
       </w:pPr>
@@ -5018,7 +4836,7 @@
           <w:ilvl w:val="0"/>
           <w:numId w:val="201"/>
         </w:numPr>
-        <w:spacing w:after="60" w:line="312" w:lineRule="auto"/>
+        <w:spacing w:after="60" w:line="360" w:lineRule="auto"/>
         <w:ind w:left="720" w:hanging="360"/>
         <w:jc w:val="both"/>
       </w:pPr>
@@ -5036,7 +4854,7 @@
           <w:ilvl w:val="0"/>
           <w:numId w:val="201"/>
         </w:numPr>
-        <w:spacing w:after="60" w:line="312" w:lineRule="auto"/>
+        <w:spacing w:after="60" w:line="360" w:lineRule="auto"/>
         <w:ind w:left="720" w:hanging="360"/>
         <w:jc w:val="both"/>
       </w:pPr>
@@ -5054,7 +4872,7 @@
           <w:ilvl w:val="0"/>
           <w:numId w:val="201"/>
         </w:numPr>
-        <w:spacing w:after="60" w:line="312" w:lineRule="auto"/>
+        <w:spacing w:after="60" w:line="360" w:lineRule="auto"/>
         <w:ind w:left="720" w:hanging="360"/>
         <w:jc w:val="both"/>
       </w:pPr>
@@ -5089,7 +4907,7 @@
     <w:p>
       <w:pPr>
         <w:pStyle w:val="Normal1"/>
-        <w:spacing w:after="120" w:line="312" w:lineRule="auto"/>
+        <w:spacing w:after="120" w:line="360" w:lineRule="auto"/>
         <w:jc w:val="both"/>
       </w:pPr>
       <w:r>
@@ -5198,7 +5016,7 @@
     <w:p>
       <w:pPr>
         <w:pStyle w:val="Normal1"/>
-        <w:spacing w:after="120" w:line="312" w:lineRule="auto"/>
+        <w:spacing w:after="120" w:line="360" w:lineRule="auto"/>
         <w:jc w:val="both"/>
       </w:pPr>
       <w:r>
@@ -5236,7 +5054,7 @@
           <w:ilvl w:val="0"/>
           <w:numId w:val="201"/>
         </w:numPr>
-        <w:spacing w:after="60" w:line="312" w:lineRule="auto"/>
+        <w:spacing w:after="60" w:line="360" w:lineRule="auto"/>
         <w:ind w:left="720" w:hanging="360"/>
         <w:jc w:val="both"/>
       </w:pPr>
@@ -5254,7 +5072,7 @@
           <w:ilvl w:val="0"/>
           <w:numId w:val="201"/>
         </w:numPr>
-        <w:spacing w:after="60" w:line="312" w:lineRule="auto"/>
+        <w:spacing w:after="60" w:line="360" w:lineRule="auto"/>
         <w:ind w:left="720" w:hanging="360"/>
         <w:jc w:val="both"/>
       </w:pPr>
@@ -5285,7 +5103,7 @@
           <w:ilvl w:val="0"/>
           <w:numId w:val="201"/>
         </w:numPr>
-        <w:spacing w:after="60" w:line="312" w:lineRule="auto"/>
+        <w:spacing w:after="60" w:line="360" w:lineRule="auto"/>
         <w:ind w:left="720" w:hanging="360"/>
         <w:jc w:val="both"/>
       </w:pPr>
@@ -5407,7 +5225,7 @@
           <w:ilvl w:val="0"/>
           <w:numId w:val="201"/>
         </w:numPr>
-        <w:spacing w:after="60" w:line="312" w:lineRule="auto"/>
+        <w:spacing w:after="60" w:line="360" w:lineRule="auto"/>
         <w:ind w:left="720" w:hanging="360"/>
         <w:jc w:val="both"/>
       </w:pPr>
@@ -5451,7 +5269,7 @@
           <w:ilvl w:val="0"/>
           <w:numId w:val="201"/>
         </w:numPr>
-        <w:spacing w:after="60" w:line="312" w:lineRule="auto"/>
+        <w:spacing w:after="60" w:line="360" w:lineRule="auto"/>
         <w:ind w:left="720" w:hanging="360"/>
         <w:jc w:val="both"/>
       </w:pPr>
@@ -5499,7 +5317,7 @@
     <w:p>
       <w:pPr>
         <w:pStyle w:val="Normal1"/>
-        <w:spacing w:after="120" w:line="312" w:lineRule="auto"/>
+        <w:spacing w:after="120" w:line="360" w:lineRule="auto"/>
         <w:jc w:val="both"/>
       </w:pPr>
       <w:r>
@@ -5651,7 +5469,7 @@
     <w:p>
       <w:pPr>
         <w:pStyle w:val="Normal1"/>
-        <w:spacing w:after="120" w:line="312" w:lineRule="auto"/>
+        <w:spacing w:after="120" w:line="360" w:lineRule="auto"/>
         <w:jc w:val="both"/>
       </w:pPr>
       <w:r>
@@ -5689,7 +5507,7 @@
           <w:ilvl w:val="0"/>
           <w:numId w:val="201"/>
         </w:numPr>
-        <w:spacing w:after="60" w:line="312" w:lineRule="auto"/>
+        <w:spacing w:after="60" w:line="360" w:lineRule="auto"/>
         <w:ind w:left="720" w:hanging="360"/>
         <w:jc w:val="both"/>
       </w:pPr>
@@ -5707,7 +5525,7 @@
           <w:ilvl w:val="0"/>
           <w:numId w:val="201"/>
         </w:numPr>
-        <w:spacing w:after="60" w:line="312" w:lineRule="auto"/>
+        <w:spacing w:after="60" w:line="360" w:lineRule="auto"/>
         <w:ind w:left="720" w:hanging="360"/>
         <w:jc w:val="both"/>
       </w:pPr>
@@ -5803,7 +5621,7 @@
           <w:ilvl w:val="0"/>
           <w:numId w:val="201"/>
         </w:numPr>
-        <w:spacing w:after="60" w:line="312" w:lineRule="auto"/>
+        <w:spacing w:after="60" w:line="360" w:lineRule="auto"/>
         <w:ind w:left="720" w:hanging="360"/>
         <w:jc w:val="both"/>
       </w:pPr>
@@ -5886,7 +5704,7 @@
           <w:ilvl w:val="0"/>
           <w:numId w:val="201"/>
         </w:numPr>
-        <w:spacing w:after="60" w:line="312" w:lineRule="auto"/>
+        <w:spacing w:after="60" w:line="360" w:lineRule="auto"/>
         <w:ind w:left="720" w:hanging="360"/>
         <w:jc w:val="both"/>
       </w:pPr>
@@ -5917,7 +5735,7 @@
           <w:ilvl w:val="0"/>
           <w:numId w:val="201"/>
         </w:numPr>
-        <w:spacing w:after="60" w:line="312" w:lineRule="auto"/>
+        <w:spacing w:after="60" w:line="360" w:lineRule="auto"/>
         <w:ind w:left="720" w:hanging="360"/>
         <w:jc w:val="both"/>
       </w:pPr>
@@ -5952,7 +5770,7 @@
     <w:p>
       <w:pPr>
         <w:pStyle w:val="Normal1"/>
-        <w:spacing w:after="120" w:line="312" w:lineRule="auto"/>
+        <w:spacing w:after="120" w:line="360" w:lineRule="auto"/>
         <w:jc w:val="both"/>
       </w:pPr>
       <w:r>
@@ -6003,6 +5821,7 @@
             <w:pPr>
               <w:keepNext/>
               <w:spacing w:after="20"/>
+              <w:jc w:val="both"/>
             </w:pPr>
             <w:r>
               <w:rPr>
@@ -6022,6 +5841,7 @@
             <w:pPr>
               <w:keepNext/>
               <w:spacing w:after="20"/>
+              <w:jc w:val="both"/>
             </w:pPr>
             <w:r>
               <w:rPr>
@@ -6045,6 +5865,7 @@
             <w:pPr>
               <w:keepNext/>
               <w:spacing w:after="20"/>
+              <w:jc w:val="both"/>
             </w:pPr>
             <w:r>
               <w:rPr>
@@ -6062,6 +5883,7 @@
             <w:pPr>
               <w:keepNext/>
               <w:spacing w:after="20"/>
+              <w:jc w:val="both"/>
             </w:pPr>
             <w:r>
               <w:rPr>
@@ -6084,6 +5906,7 @@
             <w:pPr>
               <w:keepNext/>
               <w:spacing w:after="20"/>
+              <w:jc w:val="both"/>
             </w:pPr>
             <w:r>
               <w:rPr>
@@ -6101,6 +5924,7 @@
             <w:pPr>
               <w:keepNext/>
               <w:spacing w:after="20"/>
+              <w:jc w:val="both"/>
             </w:pPr>
             <w:r>
               <w:rPr>
@@ -6123,6 +5947,7 @@
             <w:pPr>
               <w:keepNext/>
               <w:spacing w:after="20"/>
+              <w:jc w:val="both"/>
             </w:pPr>
             <w:r>
               <w:rPr>
@@ -6140,6 +5965,7 @@
             <w:pPr>
               <w:keepNext/>
               <w:spacing w:after="20"/>
+              <w:jc w:val="both"/>
             </w:pPr>
             <w:r>
               <w:rPr>
@@ -6162,6 +5988,7 @@
             <w:pPr>
               <w:keepNext/>
               <w:spacing w:after="20"/>
+              <w:jc w:val="both"/>
             </w:pPr>
             <w:r>
               <w:rPr>
@@ -6179,6 +6006,7 @@
             <w:pPr>
               <w:keepNext/>
               <w:spacing w:after="20"/>
+              <w:jc w:val="both"/>
             </w:pPr>
             <w:r>
               <w:rPr>
@@ -6200,6 +6028,7 @@
           <w:p>
             <w:pPr>
               <w:spacing w:after="20"/>
+              <w:jc w:val="both"/>
             </w:pPr>
             <w:r>
               <w:rPr>
@@ -6216,6 +6045,7 @@
           <w:p>
             <w:pPr>
               <w:spacing w:after="20"/>
+              <w:jc w:val="both"/>
             </w:pPr>
             <w:r>
               <w:rPr>
@@ -6251,7 +6081,7 @@
     <w:p>
       <w:pPr>
         <w:pStyle w:val="Normal1"/>
-        <w:spacing w:after="120" w:line="312" w:lineRule="auto"/>
+        <w:spacing w:after="120" w:line="360" w:lineRule="auto"/>
         <w:jc w:val="both"/>
       </w:pPr>
       <w:r>
@@ -6289,7 +6119,7 @@
           <w:ilvl w:val="0"/>
           <w:numId w:val="201"/>
         </w:numPr>
-        <w:spacing w:after="60" w:line="312" w:lineRule="auto"/>
+        <w:spacing w:after="60" w:line="360" w:lineRule="auto"/>
         <w:ind w:left="720" w:hanging="360"/>
         <w:jc w:val="both"/>
       </w:pPr>
@@ -6307,7 +6137,7 @@
           <w:ilvl w:val="0"/>
           <w:numId w:val="201"/>
         </w:numPr>
-        <w:spacing w:after="60" w:line="312" w:lineRule="auto"/>
+        <w:spacing w:after="60" w:line="360" w:lineRule="auto"/>
         <w:ind w:left="720" w:hanging="360"/>
         <w:jc w:val="both"/>
       </w:pPr>
@@ -6325,7 +6155,7 @@
           <w:ilvl w:val="0"/>
           <w:numId w:val="201"/>
         </w:numPr>
-        <w:spacing w:after="60" w:line="312" w:lineRule="auto"/>
+        <w:spacing w:after="60" w:line="360" w:lineRule="auto"/>
         <w:ind w:left="720" w:hanging="360"/>
         <w:jc w:val="both"/>
       </w:pPr>
@@ -6382,7 +6212,7 @@
           <w:ilvl w:val="0"/>
           <w:numId w:val="201"/>
         </w:numPr>
-        <w:spacing w:after="60" w:line="312" w:lineRule="auto"/>
+        <w:spacing w:after="60" w:line="360" w:lineRule="auto"/>
         <w:ind w:left="720" w:hanging="360"/>
         <w:jc w:val="both"/>
       </w:pPr>
@@ -6413,7 +6243,7 @@
           <w:ilvl w:val="0"/>
           <w:numId w:val="201"/>
         </w:numPr>
-        <w:spacing w:after="60" w:line="312" w:lineRule="auto"/>
+        <w:spacing w:after="60" w:line="360" w:lineRule="auto"/>
         <w:ind w:left="720" w:hanging="360"/>
         <w:jc w:val="both"/>
       </w:pPr>
@@ -6448,7 +6278,7 @@
     <w:p>
       <w:pPr>
         <w:pStyle w:val="Normal1"/>
-        <w:spacing w:after="120" w:line="312" w:lineRule="auto"/>
+        <w:spacing w:after="120" w:line="360" w:lineRule="auto"/>
         <w:jc w:val="both"/>
       </w:pPr>
       <w:r>
@@ -6531,7 +6361,7 @@
     <w:p>
       <w:pPr>
         <w:pStyle w:val="Normal1"/>
-        <w:spacing w:after="120" w:line="312" w:lineRule="auto"/>
+        <w:spacing w:after="120" w:line="360" w:lineRule="auto"/>
         <w:jc w:val="both"/>
       </w:pPr>
       <w:r>
@@ -6569,7 +6399,7 @@
           <w:ilvl w:val="0"/>
           <w:numId w:val="201"/>
         </w:numPr>
-        <w:spacing w:after="60" w:line="312" w:lineRule="auto"/>
+        <w:spacing w:after="60" w:line="360" w:lineRule="auto"/>
         <w:ind w:left="720" w:hanging="360"/>
         <w:jc w:val="both"/>
       </w:pPr>
@@ -6626,7 +6456,7 @@
           <w:ilvl w:val="0"/>
           <w:numId w:val="201"/>
         </w:numPr>
-        <w:spacing w:after="60" w:line="312" w:lineRule="auto"/>
+        <w:spacing w:after="60" w:line="360" w:lineRule="auto"/>
         <w:ind w:left="720" w:hanging="360"/>
         <w:jc w:val="both"/>
       </w:pPr>
@@ -6644,7 +6474,7 @@
           <w:ilvl w:val="0"/>
           <w:numId w:val="201"/>
         </w:numPr>
-        <w:spacing w:after="60" w:line="312" w:lineRule="auto"/>
+        <w:spacing w:after="60" w:line="360" w:lineRule="auto"/>
         <w:ind w:left="720" w:hanging="360"/>
         <w:jc w:val="both"/>
       </w:pPr>
@@ -6675,7 +6505,7 @@
           <w:ilvl w:val="0"/>
           <w:numId w:val="201"/>
         </w:numPr>
-        <w:spacing w:after="60" w:line="312" w:lineRule="auto"/>
+        <w:spacing w:after="60" w:line="360" w:lineRule="auto"/>
         <w:ind w:left="720" w:hanging="360"/>
         <w:jc w:val="both"/>
       </w:pPr>
@@ -6693,7 +6523,7 @@
           <w:ilvl w:val="0"/>
           <w:numId w:val="201"/>
         </w:numPr>
-        <w:spacing w:after="60" w:line="312" w:lineRule="auto"/>
+        <w:spacing w:after="60" w:line="360" w:lineRule="auto"/>
         <w:ind w:left="720" w:hanging="360"/>
         <w:jc w:val="both"/>
       </w:pPr>
@@ -6728,7 +6558,7 @@
     <w:p>
       <w:pPr>
         <w:pStyle w:val="Normal1"/>
-        <w:spacing w:after="120" w:line="312" w:lineRule="auto"/>
+        <w:spacing w:after="120" w:line="360" w:lineRule="auto"/>
         <w:jc w:val="both"/>
       </w:pPr>
       <w:r>
@@ -6811,7 +6641,7 @@
     <w:p>
       <w:pPr>
         <w:pStyle w:val="Normal1"/>
-        <w:spacing w:after="120" w:line="312" w:lineRule="auto"/>
+        <w:spacing w:after="120" w:line="360" w:lineRule="auto"/>
         <w:jc w:val="both"/>
       </w:pPr>
       <w:r>
@@ -6849,7 +6679,7 @@
           <w:ilvl w:val="0"/>
           <w:numId w:val="201"/>
         </w:numPr>
-        <w:spacing w:after="60" w:line="312" w:lineRule="auto"/>
+        <w:spacing w:after="60" w:line="360" w:lineRule="auto"/>
         <w:ind w:left="720" w:hanging="360"/>
         <w:jc w:val="both"/>
       </w:pPr>
@@ -6867,7 +6697,7 @@
           <w:ilvl w:val="0"/>
           <w:numId w:val="201"/>
         </w:numPr>
-        <w:spacing w:after="60" w:line="312" w:lineRule="auto"/>
+        <w:spacing w:after="60" w:line="360" w:lineRule="auto"/>
         <w:ind w:left="720" w:hanging="360"/>
         <w:jc w:val="both"/>
       </w:pPr>
@@ -6885,7 +6715,7 @@
           <w:ilvl w:val="0"/>
           <w:numId w:val="201"/>
         </w:numPr>
-        <w:spacing w:after="60" w:line="312" w:lineRule="auto"/>
+        <w:spacing w:after="60" w:line="360" w:lineRule="auto"/>
         <w:ind w:left="720" w:hanging="360"/>
         <w:jc w:val="both"/>
       </w:pPr>
@@ -6903,7 +6733,7 @@
           <w:ilvl w:val="0"/>
           <w:numId w:val="201"/>
         </w:numPr>
-        <w:spacing w:after="60" w:line="312" w:lineRule="auto"/>
+        <w:spacing w:after="60" w:line="360" w:lineRule="auto"/>
         <w:ind w:left="720" w:hanging="360"/>
         <w:jc w:val="both"/>
       </w:pPr>
@@ -6934,7 +6764,7 @@
           <w:ilvl w:val="0"/>
           <w:numId w:val="201"/>
         </w:numPr>
-        <w:spacing w:after="60" w:line="312" w:lineRule="auto"/>
+        <w:spacing w:after="60" w:line="360" w:lineRule="auto"/>
         <w:ind w:left="720" w:hanging="360"/>
         <w:jc w:val="both"/>
       </w:pPr>
@@ -6965,7 +6795,7 @@
           <w:ilvl w:val="0"/>
           <w:numId w:val="201"/>
         </w:numPr>
-        <w:spacing w:after="60" w:line="312" w:lineRule="auto"/>
+        <w:spacing w:after="60" w:line="360" w:lineRule="auto"/>
         <w:ind w:left="720" w:hanging="360"/>
         <w:jc w:val="both"/>
       </w:pPr>
@@ -7024,6 +6854,7 @@
             <w:pPr>
               <w:keepNext/>
               <w:spacing w:after="20"/>
+              <w:jc w:val="both"/>
             </w:pPr>
             <w:r>
               <w:rPr>
@@ -7043,6 +6874,7 @@
             <w:pPr>
               <w:keepNext/>
               <w:spacing w:after="20"/>
+              <w:jc w:val="both"/>
             </w:pPr>
             <w:r>
               <w:rPr>
@@ -7066,6 +6898,7 @@
             <w:pPr>
               <w:keepNext/>
               <w:spacing w:after="20"/>
+              <w:jc w:val="both"/>
             </w:pPr>
             <w:r>
               <w:rPr>
@@ -7083,6 +6916,7 @@
             <w:pPr>
               <w:keepNext/>
               <w:spacing w:after="20"/>
+              <w:jc w:val="both"/>
             </w:pPr>
             <w:r>
               <w:rPr>
@@ -7105,6 +6939,7 @@
             <w:pPr>
               <w:keepNext/>
               <w:spacing w:after="20"/>
+              <w:jc w:val="both"/>
             </w:pPr>
             <w:r>
               <w:rPr>
@@ -7122,6 +6957,7 @@
             <w:pPr>
               <w:keepNext/>
               <w:spacing w:after="20"/>
+              <w:jc w:val="both"/>
             </w:pPr>
             <w:r>
               <w:rPr>
@@ -7144,6 +6980,7 @@
             <w:pPr>
               <w:keepNext/>
               <w:spacing w:after="20"/>
+              <w:jc w:val="both"/>
             </w:pPr>
             <w:r>
               <w:rPr>
@@ -7161,6 +6998,7 @@
             <w:pPr>
               <w:keepNext/>
               <w:spacing w:after="20"/>
+              <w:jc w:val="both"/>
             </w:pPr>
             <w:r>
               <w:rPr>
@@ -7183,6 +7021,7 @@
             <w:pPr>
               <w:keepNext/>
               <w:spacing w:after="20"/>
+              <w:jc w:val="both"/>
             </w:pPr>
             <w:r>
               <w:rPr>
@@ -7200,6 +7039,7 @@
             <w:pPr>
               <w:keepNext/>
               <w:spacing w:after="20"/>
+              <w:jc w:val="both"/>
             </w:pPr>
             <w:r>
               <w:rPr>
@@ -7221,6 +7061,7 @@
           <w:p>
             <w:pPr>
               <w:spacing w:after="20"/>
+              <w:jc w:val="both"/>
             </w:pPr>
             <w:r>
               <w:rPr>
@@ -7237,6 +7078,7 @@
           <w:p>
             <w:pPr>
               <w:spacing w:after="20"/>
+              <w:jc w:val="both"/>
             </w:pPr>
             <w:r>
               <w:rPr>
@@ -7272,7 +7114,7 @@
     <w:p>
       <w:pPr>
         <w:pStyle w:val="Normal1"/>
-        <w:spacing w:after="120" w:line="312" w:lineRule="auto"/>
+        <w:spacing w:after="120" w:line="360" w:lineRule="auto"/>
         <w:jc w:val="both"/>
       </w:pPr>
       <w:r>
@@ -7355,7 +7197,7 @@
     <w:p>
       <w:pPr>
         <w:pStyle w:val="Normal1"/>
-        <w:spacing w:after="120" w:line="312" w:lineRule="auto"/>
+        <w:spacing w:after="120" w:line="360" w:lineRule="auto"/>
         <w:jc w:val="both"/>
       </w:pPr>
       <w:r>
@@ -7393,7 +7235,7 @@
           <w:ilvl w:val="0"/>
           <w:numId w:val="201"/>
         </w:numPr>
-        <w:spacing w:after="60" w:line="312" w:lineRule="auto"/>
+        <w:spacing w:after="60" w:line="360" w:lineRule="auto"/>
         <w:ind w:left="720" w:hanging="360"/>
         <w:jc w:val="both"/>
       </w:pPr>
@@ -7418,7 +7260,7 @@
           <w:ilvl w:val="0"/>
           <w:numId w:val="201"/>
         </w:numPr>
-        <w:spacing w:after="60" w:line="312" w:lineRule="auto"/>
+        <w:spacing w:after="60" w:line="360" w:lineRule="auto"/>
         <w:ind w:left="720" w:hanging="360"/>
         <w:jc w:val="both"/>
       </w:pPr>
@@ -7469,7 +7311,7 @@
           <w:ilvl w:val="0"/>
           <w:numId w:val="201"/>
         </w:numPr>
-        <w:spacing w:after="60" w:line="312" w:lineRule="auto"/>
+        <w:spacing w:after="60" w:line="360" w:lineRule="auto"/>
         <w:ind w:left="720" w:hanging="360"/>
         <w:jc w:val="both"/>
       </w:pPr>
@@ -7507,7 +7349,7 @@
           <w:ilvl w:val="0"/>
           <w:numId w:val="201"/>
         </w:numPr>
-        <w:spacing w:after="60" w:line="312" w:lineRule="auto"/>
+        <w:spacing w:after="60" w:line="360" w:lineRule="auto"/>
         <w:ind w:left="720" w:hanging="360"/>
         <w:jc w:val="both"/>
       </w:pPr>
@@ -7532,7 +7374,7 @@
           <w:ilvl w:val="0"/>
           <w:numId w:val="201"/>
         </w:numPr>
-        <w:spacing w:after="60" w:line="312" w:lineRule="auto"/>
+        <w:spacing w:after="60" w:line="360" w:lineRule="auto"/>
         <w:ind w:left="720" w:hanging="360"/>
         <w:jc w:val="both"/>
       </w:pPr>
@@ -7557,7 +7399,7 @@
           <w:ilvl w:val="0"/>
           <w:numId w:val="201"/>
         </w:numPr>
-        <w:spacing w:after="60" w:line="312" w:lineRule="auto"/>
+        <w:spacing w:after="60" w:line="360" w:lineRule="auto"/>
         <w:ind w:left="720" w:hanging="360"/>
         <w:jc w:val="both"/>
       </w:pPr>
@@ -7605,7 +7447,7 @@
     <w:p>
       <w:pPr>
         <w:pStyle w:val="Normal1"/>
-        <w:spacing w:after="120" w:line="312" w:lineRule="auto"/>
+        <w:spacing w:after="120" w:line="360" w:lineRule="auto"/>
         <w:jc w:val="both"/>
       </w:pPr>
       <w:r>
@@ -7688,7 +7530,7 @@
     <w:p>
       <w:pPr>
         <w:pStyle w:val="Normal1"/>
-        <w:spacing w:after="120" w:line="312" w:lineRule="auto"/>
+        <w:spacing w:after="120" w:line="360" w:lineRule="auto"/>
         <w:jc w:val="both"/>
       </w:pPr>
       <w:r>
@@ -7726,7 +7568,7 @@
           <w:ilvl w:val="0"/>
           <w:numId w:val="201"/>
         </w:numPr>
-        <w:spacing w:after="60" w:line="312" w:lineRule="auto"/>
+        <w:spacing w:after="60" w:line="360" w:lineRule="auto"/>
         <w:ind w:left="720" w:hanging="360"/>
         <w:jc w:val="both"/>
       </w:pPr>
@@ -7744,7 +7586,7 @@
           <w:ilvl w:val="0"/>
           <w:numId w:val="201"/>
         </w:numPr>
-        <w:spacing w:after="60" w:line="312" w:lineRule="auto"/>
+        <w:spacing w:after="60" w:line="360" w:lineRule="auto"/>
         <w:ind w:left="720" w:hanging="360"/>
         <w:jc w:val="both"/>
       </w:pPr>
@@ -7762,7 +7604,7 @@
           <w:ilvl w:val="0"/>
           <w:numId w:val="201"/>
         </w:numPr>
-        <w:spacing w:after="60" w:line="312" w:lineRule="auto"/>
+        <w:spacing w:after="60" w:line="360" w:lineRule="auto"/>
         <w:ind w:left="720" w:hanging="360"/>
         <w:jc w:val="both"/>
       </w:pPr>
@@ -7780,7 +7622,7 @@
           <w:ilvl w:val="0"/>
           <w:numId w:val="201"/>
         </w:numPr>
-        <w:spacing w:after="60" w:line="312" w:lineRule="auto"/>
+        <w:spacing w:after="60" w:line="360" w:lineRule="auto"/>
         <w:ind w:left="720" w:hanging="360"/>
         <w:jc w:val="both"/>
       </w:pPr>
@@ -7815,7 +7657,7 @@
     <w:p>
       <w:pPr>
         <w:pStyle w:val="Normal1"/>
-        <w:spacing w:after="120" w:line="312" w:lineRule="auto"/>
+        <w:spacing w:after="120" w:line="360" w:lineRule="auto"/>
         <w:jc w:val="both"/>
       </w:pPr>
       <w:r>
@@ -7967,7 +7809,7 @@
     <w:p>
       <w:pPr>
         <w:pStyle w:val="Normal1"/>
-        <w:spacing w:after="120" w:line="312" w:lineRule="auto"/>
+        <w:spacing w:after="120" w:line="360" w:lineRule="auto"/>
         <w:jc w:val="both"/>
       </w:pPr>
       <w:r>
@@ -8005,7 +7847,7 @@
           <w:ilvl w:val="0"/>
           <w:numId w:val="201"/>
         </w:numPr>
-        <w:spacing w:after="60" w:line="312" w:lineRule="auto"/>
+        <w:spacing w:after="60" w:line="360" w:lineRule="auto"/>
         <w:ind w:left="720" w:hanging="360"/>
         <w:jc w:val="both"/>
       </w:pPr>
@@ -8023,7 +7865,7 @@
           <w:ilvl w:val="0"/>
           <w:numId w:val="201"/>
         </w:numPr>
-        <w:spacing w:after="60" w:line="312" w:lineRule="auto"/>
+        <w:spacing w:after="60" w:line="360" w:lineRule="auto"/>
         <w:ind w:left="720" w:hanging="360"/>
         <w:jc w:val="both"/>
       </w:pPr>
@@ -8041,7 +7883,7 @@
           <w:ilvl w:val="0"/>
           <w:numId w:val="201"/>
         </w:numPr>
-        <w:spacing w:after="60" w:line="312" w:lineRule="auto"/>
+        <w:spacing w:after="60" w:line="360" w:lineRule="auto"/>
         <w:ind w:left="720" w:hanging="360"/>
         <w:jc w:val="both"/>
       </w:pPr>
@@ -8059,7 +7901,7 @@
           <w:ilvl w:val="0"/>
           <w:numId w:val="201"/>
         </w:numPr>
-        <w:spacing w:after="60" w:line="312" w:lineRule="auto"/>
+        <w:spacing w:after="60" w:line="360" w:lineRule="auto"/>
         <w:ind w:left="720" w:hanging="360"/>
         <w:jc w:val="both"/>
       </w:pPr>
@@ -8150,7 +7992,7 @@
     <w:p>
       <w:pPr>
         <w:pStyle w:val="Normal1"/>
-        <w:spacing w:after="120" w:line="312" w:lineRule="auto"/>
+        <w:spacing w:after="120" w:line="360" w:lineRule="auto"/>
         <w:jc w:val="both"/>
       </w:pPr>
       <w:r>
@@ -8170,7 +8012,7 @@
       <w:r>
         <w:drawing>
           <wp:inline xmlns:a="http://schemas.openxmlformats.org/drawingml/2006/main" xmlns:pic="http://schemas.openxmlformats.org/drawingml/2006/picture">
-            <wp:extent cx="4572000" cy="2576945"/>
+            <wp:extent cx="5760720" cy="3246951"/>
             <wp:docPr id="870917310" name="Picture 870917310"/>
             <wp:cNvGraphicFramePr>
               <a:graphicFrameLocks noChangeAspect="1"/>
@@ -8191,7 +8033,7 @@
                   <pic:spPr>
                     <a:xfrm>
                       <a:off x="0" y="0"/>
-                      <a:ext cx="4572000" cy="2576945"/>
+                      <a:ext cx="5760720" cy="3246951"/>
                     </a:xfrm>
                     <a:prstGeom prst="rect"/>
                   </pic:spPr>
@@ -8233,7 +8075,7 @@
     <w:p>
       <w:pPr>
         <w:pStyle w:val="Normal1"/>
-        <w:spacing w:after="120" w:line="312" w:lineRule="auto"/>
+        <w:spacing w:after="120" w:line="360" w:lineRule="auto"/>
         <w:jc w:val="both"/>
       </w:pPr>
       <w:r>
@@ -8271,7 +8113,7 @@
           <w:ilvl w:val="0"/>
           <w:numId w:val="201"/>
         </w:numPr>
-        <w:spacing w:after="60" w:line="312" w:lineRule="auto"/>
+        <w:spacing w:after="60" w:line="360" w:lineRule="auto"/>
         <w:ind w:left="720" w:hanging="360"/>
         <w:jc w:val="both"/>
       </w:pPr>
@@ -8315,7 +8157,7 @@
           <w:ilvl w:val="0"/>
           <w:numId w:val="201"/>
         </w:numPr>
-        <w:spacing w:after="60" w:line="312" w:lineRule="auto"/>
+        <w:spacing w:after="60" w:line="360" w:lineRule="auto"/>
         <w:ind w:left="720" w:hanging="360"/>
         <w:jc w:val="both"/>
       </w:pPr>
@@ -8359,7 +8201,7 @@
           <w:ilvl w:val="0"/>
           <w:numId w:val="201"/>
         </w:numPr>
-        <w:spacing w:after="60" w:line="312" w:lineRule="auto"/>
+        <w:spacing w:after="60" w:line="360" w:lineRule="auto"/>
         <w:ind w:left="720" w:hanging="360"/>
         <w:jc w:val="both"/>
       </w:pPr>
@@ -8390,7 +8232,7 @@
           <w:ilvl w:val="0"/>
           <w:numId w:val="201"/>
         </w:numPr>
-        <w:spacing w:after="60" w:line="312" w:lineRule="auto"/>
+        <w:spacing w:after="60" w:line="360" w:lineRule="auto"/>
         <w:ind w:left="720" w:hanging="360"/>
         <w:jc w:val="both"/>
       </w:pPr>
@@ -8425,7 +8267,7 @@
     <w:p>
       <w:pPr>
         <w:pStyle w:val="Normal1"/>
-        <w:spacing w:after="120" w:line="312" w:lineRule="auto"/>
+        <w:spacing w:after="120" w:line="360" w:lineRule="auto"/>
         <w:jc w:val="both"/>
       </w:pPr>
       <w:r>
@@ -8534,7 +8376,7 @@
     <w:p>
       <w:pPr>
         <w:pStyle w:val="Normal1"/>
-        <w:spacing w:after="120" w:line="312" w:lineRule="auto"/>
+        <w:spacing w:after="120" w:line="360" w:lineRule="auto"/>
         <w:jc w:val="both"/>
       </w:pPr>
       <w:r>
@@ -8572,7 +8414,7 @@
           <w:ilvl w:val="0"/>
           <w:numId w:val="201"/>
         </w:numPr>
-        <w:spacing w:after="60" w:line="312" w:lineRule="auto"/>
+        <w:spacing w:after="60" w:line="360" w:lineRule="auto"/>
         <w:ind w:left="720" w:hanging="360"/>
         <w:jc w:val="both"/>
       </w:pPr>
@@ -8603,7 +8445,7 @@
           <w:ilvl w:val="0"/>
           <w:numId w:val="201"/>
         </w:numPr>
-        <w:spacing w:after="60" w:line="312" w:lineRule="auto"/>
+        <w:spacing w:after="60" w:line="360" w:lineRule="auto"/>
         <w:ind w:left="720" w:hanging="360"/>
         <w:jc w:val="both"/>
       </w:pPr>
@@ -8634,7 +8476,7 @@
           <w:ilvl w:val="0"/>
           <w:numId w:val="201"/>
         </w:numPr>
-        <w:spacing w:after="60" w:line="312" w:lineRule="auto"/>
+        <w:spacing w:after="60" w:line="360" w:lineRule="auto"/>
         <w:ind w:left="720" w:hanging="360"/>
         <w:jc w:val="both"/>
       </w:pPr>
@@ -8751,7 +8593,7 @@
     <w:p>
       <w:pPr>
         <w:pStyle w:val="Normal1"/>
-        <w:spacing w:after="120" w:line="312" w:lineRule="auto"/>
+        <w:spacing w:after="120" w:line="360" w:lineRule="auto"/>
         <w:jc w:val="both"/>
       </w:pPr>
       <w:r>
@@ -8873,7 +8715,7 @@
     <w:p>
       <w:pPr>
         <w:pStyle w:val="Normal1"/>
-        <w:spacing w:after="120" w:line="312" w:lineRule="auto"/>
+        <w:spacing w:after="120" w:line="360" w:lineRule="auto"/>
         <w:jc w:val="both"/>
       </w:pPr>
       <w:r>
@@ -8911,7 +8753,7 @@
           <w:ilvl w:val="0"/>
           <w:numId w:val="201"/>
         </w:numPr>
-        <w:spacing w:after="60" w:line="312" w:lineRule="auto"/>
+        <w:spacing w:after="60" w:line="360" w:lineRule="auto"/>
         <w:ind w:left="720" w:hanging="360"/>
         <w:jc w:val="both"/>
       </w:pPr>
@@ -8942,7 +8784,7 @@
           <w:ilvl w:val="0"/>
           <w:numId w:val="201"/>
         </w:numPr>
-        <w:spacing w:after="60" w:line="312" w:lineRule="auto"/>
+        <w:spacing w:after="60" w:line="360" w:lineRule="auto"/>
         <w:ind w:left="720" w:hanging="360"/>
         <w:jc w:val="both"/>
       </w:pPr>
@@ -8986,7 +8828,7 @@
           <w:ilvl w:val="0"/>
           <w:numId w:val="201"/>
         </w:numPr>
-        <w:spacing w:after="60" w:line="312" w:lineRule="auto"/>
+        <w:spacing w:after="60" w:line="360" w:lineRule="auto"/>
         <w:ind w:left="720" w:hanging="360"/>
         <w:jc w:val="both"/>
       </w:pPr>
@@ -9004,7 +8846,7 @@
           <w:ilvl w:val="0"/>
           <w:numId w:val="201"/>
         </w:numPr>
-        <w:spacing w:after="60" w:line="312" w:lineRule="auto"/>
+        <w:spacing w:after="60" w:line="360" w:lineRule="auto"/>
         <w:ind w:left="720" w:hanging="360"/>
         <w:jc w:val="both"/>
       </w:pPr>
@@ -9108,7 +8950,7 @@
     <w:p>
       <w:pPr>
         <w:pStyle w:val="Normal1"/>
-        <w:spacing w:after="120" w:line="312" w:lineRule="auto"/>
+        <w:spacing w:after="120" w:line="360" w:lineRule="auto"/>
         <w:jc w:val="both"/>
       </w:pPr>
       <w:r>
@@ -9204,7 +9046,7 @@
     <w:p>
       <w:pPr>
         <w:pStyle w:val="Normal1"/>
-        <w:spacing w:after="120" w:line="312" w:lineRule="auto"/>
+        <w:spacing w:after="120" w:line="360" w:lineRule="auto"/>
         <w:jc w:val="both"/>
       </w:pPr>
       <w:r>
@@ -9242,7 +9084,7 @@
           <w:ilvl w:val="0"/>
           <w:numId w:val="201"/>
         </w:numPr>
-        <w:spacing w:after="60" w:line="312" w:lineRule="auto"/>
+        <w:spacing w:after="60" w:line="360" w:lineRule="auto"/>
         <w:ind w:left="720" w:hanging="360"/>
         <w:jc w:val="both"/>
       </w:pPr>
@@ -9273,7 +9115,7 @@
           <w:ilvl w:val="0"/>
           <w:numId w:val="201"/>
         </w:numPr>
-        <w:spacing w:after="60" w:line="312" w:lineRule="auto"/>
+        <w:spacing w:after="60" w:line="360" w:lineRule="auto"/>
         <w:ind w:left="720" w:hanging="360"/>
         <w:jc w:val="both"/>
       </w:pPr>
@@ -9317,7 +9159,7 @@
           <w:ilvl w:val="0"/>
           <w:numId w:val="201"/>
         </w:numPr>
-        <w:spacing w:after="60" w:line="312" w:lineRule="auto"/>
+        <w:spacing w:after="60" w:line="360" w:lineRule="auto"/>
         <w:ind w:left="720" w:hanging="360"/>
         <w:jc w:val="both"/>
       </w:pPr>
@@ -9348,7 +9190,7 @@
           <w:ilvl w:val="0"/>
           <w:numId w:val="201"/>
         </w:numPr>
-        <w:spacing w:after="60" w:line="312" w:lineRule="auto"/>
+        <w:spacing w:after="60" w:line="360" w:lineRule="auto"/>
         <w:ind w:left="720" w:hanging="360"/>
         <w:jc w:val="both"/>
       </w:pPr>
@@ -9452,7 +9294,7 @@
     <w:p>
       <w:pPr>
         <w:pStyle w:val="Normal1"/>
-        <w:spacing w:after="120" w:line="312" w:lineRule="auto"/>
+        <w:spacing w:after="120" w:line="360" w:lineRule="auto"/>
         <w:jc w:val="both"/>
       </w:pPr>
       <w:r>
@@ -9574,7 +9416,7 @@
     <w:p>
       <w:pPr>
         <w:pStyle w:val="Normal1"/>
-        <w:spacing w:after="120" w:line="312" w:lineRule="auto"/>
+        <w:spacing w:after="120" w:line="360" w:lineRule="auto"/>
         <w:jc w:val="both"/>
       </w:pPr>
       <w:r>
@@ -9612,7 +9454,7 @@
           <w:ilvl w:val="0"/>
           <w:numId w:val="201"/>
         </w:numPr>
-        <w:spacing w:after="60" w:line="312" w:lineRule="auto"/>
+        <w:spacing w:after="60" w:line="360" w:lineRule="auto"/>
         <w:ind w:left="720" w:hanging="360"/>
         <w:jc w:val="both"/>
       </w:pPr>
@@ -9656,7 +9498,7 @@
           <w:ilvl w:val="0"/>
           <w:numId w:val="201"/>
         </w:numPr>
-        <w:spacing w:after="60" w:line="312" w:lineRule="auto"/>
+        <w:spacing w:after="60" w:line="360" w:lineRule="auto"/>
         <w:ind w:left="720" w:hanging="360"/>
         <w:jc w:val="both"/>
       </w:pPr>
@@ -9713,7 +9555,7 @@
           <w:ilvl w:val="0"/>
           <w:numId w:val="201"/>
         </w:numPr>
-        <w:spacing w:after="60" w:line="312" w:lineRule="auto"/>
+        <w:spacing w:after="60" w:line="360" w:lineRule="auto"/>
         <w:ind w:left="720" w:hanging="360"/>
         <w:jc w:val="both"/>
       </w:pPr>
@@ -9770,7 +9612,7 @@
           <w:ilvl w:val="0"/>
           <w:numId w:val="201"/>
         </w:numPr>
-        <w:spacing w:after="60" w:line="312" w:lineRule="auto"/>
+        <w:spacing w:after="60" w:line="360" w:lineRule="auto"/>
         <w:ind w:left="720" w:hanging="360"/>
         <w:jc w:val="both"/>
       </w:pPr>
@@ -9801,7 +9643,7 @@
           <w:ilvl w:val="0"/>
           <w:numId w:val="201"/>
         </w:numPr>
-        <w:spacing w:after="60" w:line="312" w:lineRule="auto"/>
+        <w:spacing w:after="60" w:line="360" w:lineRule="auto"/>
         <w:ind w:left="720" w:hanging="360"/>
         <w:jc w:val="both"/>
       </w:pPr>
@@ -9892,7 +9734,7 @@
     <w:p>
       <w:pPr>
         <w:pStyle w:val="Normal1"/>
-        <w:spacing w:after="120" w:line="312" w:lineRule="auto"/>
+        <w:spacing w:after="120" w:line="360" w:lineRule="auto"/>
         <w:jc w:val="both"/>
       </w:pPr>
       <w:r>
@@ -9912,7 +9754,7 @@
       <w:r>
         <w:drawing>
           <wp:inline xmlns:a="http://schemas.openxmlformats.org/drawingml/2006/main" xmlns:pic="http://schemas.openxmlformats.org/drawingml/2006/picture">
-            <wp:extent cx="4754880" cy="3094570"/>
+            <wp:extent cx="5760720" cy="3749190"/>
             <wp:docPr id="870917319" name="Picture 870917319"/>
             <wp:cNvGraphicFramePr>
               <a:graphicFrameLocks noChangeAspect="1"/>
@@ -9933,7 +9775,7 @@
                   <pic:spPr>
                     <a:xfrm>
                       <a:off x="0" y="0"/>
-                      <a:ext cx="4754880" cy="3094570"/>
+                      <a:ext cx="5760720" cy="3749190"/>
                     </a:xfrm>
                     <a:prstGeom prst="rect"/>
                   </pic:spPr>
@@ -9975,7 +9817,7 @@
     <w:p>
       <w:pPr>
         <w:pStyle w:val="Normal1"/>
-        <w:spacing w:after="120" w:line="312" w:lineRule="auto"/>
+        <w:spacing w:after="120" w:line="360" w:lineRule="auto"/>
         <w:jc w:val="both"/>
       </w:pPr>
       <w:r>
@@ -10013,7 +9855,7 @@
           <w:ilvl w:val="0"/>
           <w:numId w:val="201"/>
         </w:numPr>
-        <w:spacing w:after="60" w:line="312" w:lineRule="auto"/>
+        <w:spacing w:after="60" w:line="360" w:lineRule="auto"/>
         <w:ind w:left="720" w:hanging="360"/>
         <w:jc w:val="both"/>
       </w:pPr>
@@ -10096,7 +9938,7 @@
           <w:ilvl w:val="0"/>
           <w:numId w:val="201"/>
         </w:numPr>
-        <w:spacing w:after="60" w:line="312" w:lineRule="auto"/>
+        <w:spacing w:after="60" w:line="360" w:lineRule="auto"/>
         <w:ind w:left="720" w:hanging="360"/>
         <w:jc w:val="both"/>
       </w:pPr>
@@ -10179,7 +10021,7 @@
           <w:ilvl w:val="0"/>
           <w:numId w:val="201"/>
         </w:numPr>
-        <w:spacing w:after="60" w:line="312" w:lineRule="auto"/>
+        <w:spacing w:after="60" w:line="360" w:lineRule="auto"/>
         <w:ind w:left="720" w:hanging="360"/>
         <w:jc w:val="both"/>
       </w:pPr>
@@ -10197,7 +10039,7 @@
           <w:ilvl w:val="0"/>
           <w:numId w:val="201"/>
         </w:numPr>
-        <w:spacing w:after="60" w:line="312" w:lineRule="auto"/>
+        <w:spacing w:after="60" w:line="360" w:lineRule="auto"/>
         <w:ind w:left="720" w:hanging="360"/>
         <w:jc w:val="both"/>
       </w:pPr>
@@ -10232,7 +10074,7 @@
     <w:p>
       <w:pPr>
         <w:pStyle w:val="Normal1"/>
-        <w:spacing w:after="120" w:line="312" w:lineRule="auto"/>
+        <w:spacing w:after="120" w:line="360" w:lineRule="auto"/>
         <w:jc w:val="both"/>
       </w:pPr>
       <w:r>
@@ -10328,7 +10170,7 @@
     <w:p>
       <w:pPr>
         <w:pStyle w:val="Normal1"/>
-        <w:spacing w:after="120" w:line="312" w:lineRule="auto"/>
+        <w:spacing w:after="120" w:line="360" w:lineRule="auto"/>
         <w:jc w:val="both"/>
       </w:pPr>
       <w:r>
@@ -10352,7 +10194,7 @@
           <w:ilvl w:val="0"/>
           <w:numId w:val="203"/>
         </w:numPr>
-        <w:spacing w:after="60" w:line="312" w:lineRule="auto"/>
+        <w:spacing w:after="60" w:line="360" w:lineRule="auto"/>
         <w:ind w:left="720" w:hanging="360"/>
         <w:jc w:val="both"/>
       </w:pPr>
@@ -10377,7 +10219,7 @@
           <w:ilvl w:val="0"/>
           <w:numId w:val="203"/>
         </w:numPr>
-        <w:spacing w:after="60" w:line="312" w:lineRule="auto"/>
+        <w:spacing w:after="60" w:line="360" w:lineRule="auto"/>
         <w:ind w:left="720" w:hanging="360"/>
         <w:jc w:val="both"/>
       </w:pPr>
@@ -10402,7 +10244,7 @@
           <w:ilvl w:val="0"/>
           <w:numId w:val="203"/>
         </w:numPr>
-        <w:spacing w:after="60" w:line="312" w:lineRule="auto"/>
+        <w:spacing w:after="60" w:line="360" w:lineRule="auto"/>
         <w:ind w:left="720" w:hanging="360"/>
         <w:jc w:val="both"/>
       </w:pPr>
@@ -10427,7 +10269,7 @@
           <w:ilvl w:val="0"/>
           <w:numId w:val="203"/>
         </w:numPr>
-        <w:spacing w:after="60" w:line="312" w:lineRule="auto"/>
+        <w:spacing w:after="60" w:line="360" w:lineRule="auto"/>
         <w:ind w:left="720" w:hanging="360"/>
         <w:jc w:val="both"/>
       </w:pPr>
@@ -10452,7 +10294,7 @@
           <w:ilvl w:val="0"/>
           <w:numId w:val="203"/>
         </w:numPr>
-        <w:spacing w:after="60" w:line="312" w:lineRule="auto"/>
+        <w:spacing w:after="60" w:line="360" w:lineRule="auto"/>
         <w:ind w:left="720" w:hanging="360"/>
         <w:jc w:val="both"/>
       </w:pPr>
@@ -10480,7 +10322,7 @@
     <w:p>
       <w:pPr>
         <w:pStyle w:val="Normal1"/>
-        <w:spacing w:after="120" w:line="312" w:lineRule="auto"/>
+        <w:spacing w:after="120" w:line="360" w:lineRule="auto"/>
         <w:jc w:val="both"/>
       </w:pPr>
       <w:r>
@@ -10523,7 +10365,7 @@
           <w:ilvl w:val="0"/>
           <w:numId w:val="201"/>
         </w:numPr>
-        <w:spacing w:after="60" w:line="312" w:lineRule="auto"/>
+        <w:spacing w:after="60" w:line="360" w:lineRule="auto"/>
         <w:ind w:left="720" w:hanging="360"/>
         <w:jc w:val="both"/>
       </w:pPr>
@@ -10548,7 +10390,7 @@
           <w:ilvl w:val="0"/>
           <w:numId w:val="201"/>
         </w:numPr>
-        <w:spacing w:after="60" w:line="312" w:lineRule="auto"/>
+        <w:spacing w:after="60" w:line="360" w:lineRule="auto"/>
         <w:ind w:left="720" w:hanging="360"/>
         <w:jc w:val="both"/>
       </w:pPr>
@@ -10573,7 +10415,7 @@
           <w:ilvl w:val="0"/>
           <w:numId w:val="201"/>
         </w:numPr>
-        <w:spacing w:after="60" w:line="312" w:lineRule="auto"/>
+        <w:spacing w:after="60" w:line="360" w:lineRule="auto"/>
         <w:ind w:left="720" w:hanging="360"/>
         <w:jc w:val="both"/>
       </w:pPr>
@@ -10611,7 +10453,7 @@
           <w:ilvl w:val="0"/>
           <w:numId w:val="201"/>
         </w:numPr>
-        <w:spacing w:after="60" w:line="312" w:lineRule="auto"/>
+        <w:spacing w:after="60" w:line="360" w:lineRule="auto"/>
         <w:ind w:left="720" w:hanging="360"/>
         <w:jc w:val="both"/>
       </w:pPr>
@@ -10656,7 +10498,7 @@
           <w:ilvl w:val="0"/>
           <w:numId w:val="201"/>
         </w:numPr>
-        <w:spacing w:after="60" w:line="312" w:lineRule="auto"/>
+        <w:spacing w:after="60" w:line="360" w:lineRule="auto"/>
         <w:ind w:left="720" w:hanging="360"/>
         <w:jc w:val="both"/>
       </w:pPr>
@@ -10674,7 +10516,7 @@
           <w:ilvl w:val="0"/>
           <w:numId w:val="201"/>
         </w:numPr>
-        <w:spacing w:after="60" w:line="312" w:lineRule="auto"/>
+        <w:spacing w:after="60" w:line="360" w:lineRule="auto"/>
         <w:ind w:left="720" w:hanging="360"/>
         <w:jc w:val="both"/>
       </w:pPr>
@@ -10692,7 +10534,7 @@
           <w:ilvl w:val="0"/>
           <w:numId w:val="201"/>
         </w:numPr>
-        <w:spacing w:after="60" w:line="312" w:lineRule="auto"/>
+        <w:spacing w:after="60" w:line="360" w:lineRule="auto"/>
         <w:ind w:left="720" w:hanging="360"/>
         <w:jc w:val="both"/>
       </w:pPr>
@@ -10710,7 +10552,7 @@
           <w:ilvl w:val="0"/>
           <w:numId w:val="201"/>
         </w:numPr>
-        <w:spacing w:after="60" w:line="312" w:lineRule="auto"/>
+        <w:spacing w:after="60" w:line="360" w:lineRule="auto"/>
         <w:ind w:left="720" w:hanging="360"/>
         <w:jc w:val="both"/>
       </w:pPr>
@@ -10752,9 +10594,9 @@
     <w:p>
       <w:pPr>
         <w:pStyle w:val="Normal1"/>
-        <w:spacing w:after="120" w:line="276" w:lineRule="auto"/>
+        <w:spacing w:after="120" w:line="360" w:lineRule="auto"/>
         <w:ind w:left="576" w:hanging="576"/>
-        <w:jc w:val="left"/>
+        <w:jc w:val="both"/>
       </w:pPr>
       <w:r>
         <w:rPr>
@@ -10773,9 +10615,9 @@
     <w:p>
       <w:pPr>
         <w:pStyle w:val="Normal1"/>
-        <w:spacing w:after="120" w:line="276" w:lineRule="auto"/>
+        <w:spacing w:after="120" w:line="360" w:lineRule="auto"/>
         <w:ind w:left="576" w:hanging="576"/>
-        <w:jc w:val="left"/>
+        <w:jc w:val="both"/>
       </w:pPr>
       <w:r>
         <w:rPr>
@@ -10800,9 +10642,9 @@
     <w:p>
       <w:pPr>
         <w:pStyle w:val="Normal1"/>
-        <w:spacing w:after="120" w:line="276" w:lineRule="auto"/>
+        <w:spacing w:after="120" w:line="360" w:lineRule="auto"/>
         <w:ind w:left="576" w:hanging="576"/>
-        <w:jc w:val="left"/>
+        <w:jc w:val="both"/>
       </w:pPr>
       <w:r>
         <w:rPr>
@@ -10827,9 +10669,9 @@
     <w:p>
       <w:pPr>
         <w:pStyle w:val="Normal1"/>
-        <w:spacing w:after="120" w:line="276" w:lineRule="auto"/>
+        <w:spacing w:after="120" w:line="360" w:lineRule="auto"/>
         <w:ind w:left="576" w:hanging="576"/>
-        <w:jc w:val="left"/>
+        <w:jc w:val="both"/>
       </w:pPr>
       <w:r>
         <w:rPr>
@@ -10854,9 +10696,9 @@
     <w:p>
       <w:pPr>
         <w:pStyle w:val="Normal1"/>
-        <w:spacing w:after="120" w:line="276" w:lineRule="auto"/>
+        <w:spacing w:after="120" w:line="360" w:lineRule="auto"/>
         <w:ind w:left="576" w:hanging="576"/>
-        <w:jc w:val="left"/>
+        <w:jc w:val="both"/>
       </w:pPr>
       <w:r>
         <w:rPr>
@@ -10894,9 +10736,9 @@
     <w:p>
       <w:pPr>
         <w:pStyle w:val="Normal1"/>
-        <w:spacing w:after="120" w:line="276" w:lineRule="auto"/>
+        <w:spacing w:after="120" w:line="360" w:lineRule="auto"/>
         <w:ind w:left="576" w:hanging="576"/>
-        <w:jc w:val="left"/>
+        <w:jc w:val="both"/>
       </w:pPr>
       <w:r>
         <w:rPr>
@@ -10908,9 +10750,9 @@
     <w:p>
       <w:pPr>
         <w:pStyle w:val="Normal1"/>
-        <w:spacing w:after="120" w:line="276" w:lineRule="auto"/>
+        <w:spacing w:after="120" w:line="360" w:lineRule="auto"/>
         <w:ind w:left="576" w:hanging="576"/>
-        <w:jc w:val="left"/>
+        <w:jc w:val="both"/>
       </w:pPr>
       <w:r>
         <w:rPr>
@@ -10961,9 +10803,9 @@
     <w:p>
       <w:pPr>
         <w:pStyle w:val="Normal1"/>
-        <w:spacing w:after="120" w:line="276" w:lineRule="auto"/>
+        <w:spacing w:after="120" w:line="360" w:lineRule="auto"/>
         <w:ind w:left="576" w:hanging="576"/>
-        <w:jc w:val="left"/>
+        <w:jc w:val="both"/>
       </w:pPr>
       <w:r>
         <w:rPr>
@@ -10988,9 +10830,9 @@
     <w:p>
       <w:pPr>
         <w:pStyle w:val="Normal1"/>
-        <w:spacing w:after="120" w:line="276" w:lineRule="auto"/>
+        <w:spacing w:after="120" w:line="360" w:lineRule="auto"/>
         <w:ind w:left="576" w:hanging="576"/>
-        <w:jc w:val="left"/>
+        <w:jc w:val="both"/>
       </w:pPr>
       <w:r>
         <w:rPr>
@@ -11015,9 +10857,9 @@
     <w:p>
       <w:pPr>
         <w:pStyle w:val="Normal1"/>
-        <w:spacing w:after="120" w:line="276" w:lineRule="auto"/>
+        <w:spacing w:after="120" w:line="360" w:lineRule="auto"/>
         <w:ind w:left="576" w:hanging="576"/>
-        <w:jc w:val="left"/>
+        <w:jc w:val="both"/>
       </w:pPr>
       <w:r>
         <w:rPr>
@@ -11192,7 +11034,7 @@
     </w:r>
     <w:r>
       <w:tab/>
-      <w:t xml:space="preserve">           &lt;Enrolment No.&gt;</w:t>
+      <w:t xml:space="preserve">           231260131051</w:t>
     </w:r>
   </w:p>
   <w:p>

</xml_diff>